<commit_message>
Add project report in PDF and Word format
</commit_message>
<xml_diff>
--- a/Aviation_Project_Report.docx
+++ b/Aviation_Project_Report.docx
@@ -111,36 +111,20 @@
           <w:sz w:val="24"/>
           <w:szCs w:val="24"/>
         </w:rPr>
-        <w:t>Crisis Period</w:t>
-      </w:r>
+        <w:t>Crisis Period: February 28 – March 7, 2026</w:t>
+      </w:r>
+    </w:p>
+    <w:p>
+      <w:pPr>
+        <w:jc w:val="center"/>
+      </w:pPr>
       <w:r>
         <w:rPr>
           <w:color w:val="333333"/>
           <w:sz w:val="24"/>
           <w:szCs w:val="24"/>
         </w:rPr>
-        <w:t>: February 28 – March 7, 2026</w:t>
-      </w:r>
-    </w:p>
-    <w:p>
-      <w:pPr>
-        <w:jc w:val="center"/>
-      </w:pPr>
-      <w:r>
-        <w:rPr>
-          <w:color w:val="333333"/>
-          <w:sz w:val="24"/>
-          <w:szCs w:val="24"/>
-        </w:rPr>
-        <w:t xml:space="preserve">Analysis </w:t>
-      </w:r>
-      <w:r>
-        <w:rPr>
-          <w:color w:val="333333"/>
-          <w:sz w:val="24"/>
-          <w:szCs w:val="24"/>
-        </w:rPr>
-        <w:t>Date: March 2026</w:t>
+        <w:t>Analysis Date: March 2026</w:t>
       </w:r>
     </w:p>
     <w:p>
@@ -404,12 +388,6 @@
         <w:gridCol w:w="4360"/>
       </w:tblGrid>
       <w:tr>
-        <w:tblPrEx>
-          <w:tblCellMar>
-            <w:top w:w="0" w:type="dxa"/>
-            <w:bottom w:w="0" w:type="dxa"/>
-          </w:tblCellMar>
-        </w:tblPrEx>
         <w:tc>
           <w:tcPr>
             <w:tcW w:w="3000" w:type="dxa"/>
@@ -511,12 +489,6 @@
         </w:tc>
       </w:tr>
       <w:tr>
-        <w:tblPrEx>
-          <w:tblCellMar>
-            <w:top w:w="0" w:type="dxa"/>
-            <w:bottom w:w="0" w:type="dxa"/>
-          </w:tblCellMar>
-        </w:tblPrEx>
         <w:tc>
           <w:tcPr>
             <w:tcW w:w="3000" w:type="dxa"/>
@@ -600,12 +572,6 @@
         </w:tc>
       </w:tr>
       <w:tr>
-        <w:tblPrEx>
-          <w:tblCellMar>
-            <w:top w:w="0" w:type="dxa"/>
-            <w:bottom w:w="0" w:type="dxa"/>
-          </w:tblCellMar>
-        </w:tblPrEx>
         <w:tc>
           <w:tcPr>
             <w:tcW w:w="3000" w:type="dxa"/>
@@ -689,12 +655,6 @@
         </w:tc>
       </w:tr>
       <w:tr>
-        <w:tblPrEx>
-          <w:tblCellMar>
-            <w:top w:w="0" w:type="dxa"/>
-            <w:bottom w:w="0" w:type="dxa"/>
-          </w:tblCellMar>
-        </w:tblPrEx>
         <w:tc>
           <w:tcPr>
             <w:tcW w:w="3000" w:type="dxa"/>
@@ -778,12 +738,6 @@
         </w:tc>
       </w:tr>
       <w:tr>
-        <w:tblPrEx>
-          <w:tblCellMar>
-            <w:top w:w="0" w:type="dxa"/>
-            <w:bottom w:w="0" w:type="dxa"/>
-          </w:tblCellMar>
-        </w:tblPrEx>
         <w:tc>
           <w:tcPr>
             <w:tcW w:w="3000" w:type="dxa"/>
@@ -867,12 +821,6 @@
         </w:tc>
       </w:tr>
       <w:tr>
-        <w:tblPrEx>
-          <w:tblCellMar>
-            <w:top w:w="0" w:type="dxa"/>
-            <w:bottom w:w="0" w:type="dxa"/>
-          </w:tblCellMar>
-        </w:tblPrEx>
         <w:tc>
           <w:tcPr>
             <w:tcW w:w="3000" w:type="dxa"/>
@@ -1010,12 +958,6 @@
         <w:gridCol w:w="4677"/>
       </w:tblGrid>
       <w:tr>
-        <w:tblPrEx>
-          <w:tblCellMar>
-            <w:top w:w="0" w:type="dxa"/>
-            <w:bottom w:w="0" w:type="dxa"/>
-          </w:tblCellMar>
-        </w:tblPrEx>
         <w:tc>
           <w:tcPr>
             <w:tcW w:w="2800" w:type="dxa"/>
@@ -1150,12 +1092,6 @@
         </w:tc>
       </w:tr>
       <w:tr>
-        <w:tblPrEx>
-          <w:tblCellMar>
-            <w:top w:w="0" w:type="dxa"/>
-            <w:bottom w:w="0" w:type="dxa"/>
-          </w:tblCellMar>
-        </w:tblPrEx>
         <w:tc>
           <w:tcPr>
             <w:tcW w:w="2800" w:type="dxa"/>
@@ -1266,12 +1202,6 @@
         </w:tc>
       </w:tr>
       <w:tr>
-        <w:tblPrEx>
-          <w:tblCellMar>
-            <w:top w:w="0" w:type="dxa"/>
-            <w:bottom w:w="0" w:type="dxa"/>
-          </w:tblCellMar>
-        </w:tblPrEx>
         <w:tc>
           <w:tcPr>
             <w:tcW w:w="2800" w:type="dxa"/>
@@ -1382,12 +1312,6 @@
         </w:tc>
       </w:tr>
       <w:tr>
-        <w:tblPrEx>
-          <w:tblCellMar>
-            <w:top w:w="0" w:type="dxa"/>
-            <w:bottom w:w="0" w:type="dxa"/>
-          </w:tblCellMar>
-        </w:tblPrEx>
         <w:tc>
           <w:tcPr>
             <w:tcW w:w="2800" w:type="dxa"/>
@@ -1498,12 +1422,6 @@
         </w:tc>
       </w:tr>
       <w:tr>
-        <w:tblPrEx>
-          <w:tblCellMar>
-            <w:top w:w="0" w:type="dxa"/>
-            <w:bottom w:w="0" w:type="dxa"/>
-          </w:tblCellMar>
-        </w:tblPrEx>
         <w:tc>
           <w:tcPr>
             <w:tcW w:w="2800" w:type="dxa"/>
@@ -1614,12 +1532,6 @@
         </w:tc>
       </w:tr>
       <w:tr>
-        <w:tblPrEx>
-          <w:tblCellMar>
-            <w:top w:w="0" w:type="dxa"/>
-            <w:bottom w:w="0" w:type="dxa"/>
-          </w:tblCellMar>
-        </w:tblPrEx>
         <w:tc>
           <w:tcPr>
             <w:tcW w:w="2800" w:type="dxa"/>
@@ -1730,12 +1642,6 @@
         </w:tc>
       </w:tr>
       <w:tr>
-        <w:tblPrEx>
-          <w:tblCellMar>
-            <w:top w:w="0" w:type="dxa"/>
-            <w:bottom w:w="0" w:type="dxa"/>
-          </w:tblCellMar>
-        </w:tblPrEx>
         <w:tc>
           <w:tcPr>
             <w:tcW w:w="2800" w:type="dxa"/>
@@ -2066,12 +1972,6 @@
         <w:gridCol w:w="4960"/>
       </w:tblGrid>
       <w:tr>
-        <w:tblPrEx>
-          <w:tblCellMar>
-            <w:top w:w="0" w:type="dxa"/>
-            <w:bottom w:w="0" w:type="dxa"/>
-          </w:tblCellMar>
-        </w:tblPrEx>
         <w:tc>
           <w:tcPr>
             <w:tcW w:w="3200" w:type="dxa"/>
@@ -2173,12 +2073,6 @@
         </w:tc>
       </w:tr>
       <w:tr>
-        <w:tblPrEx>
-          <w:tblCellMar>
-            <w:top w:w="0" w:type="dxa"/>
-            <w:bottom w:w="0" w:type="dxa"/>
-          </w:tblCellMar>
-        </w:tblPrEx>
         <w:tc>
           <w:tcPr>
             <w:tcW w:w="3200" w:type="dxa"/>
@@ -2262,12 +2156,6 @@
         </w:tc>
       </w:tr>
       <w:tr>
-        <w:tblPrEx>
-          <w:tblCellMar>
-            <w:top w:w="0" w:type="dxa"/>
-            <w:bottom w:w="0" w:type="dxa"/>
-          </w:tblCellMar>
-        </w:tblPrEx>
         <w:tc>
           <w:tcPr>
             <w:tcW w:w="3200" w:type="dxa"/>
@@ -2351,12 +2239,6 @@
         </w:tc>
       </w:tr>
       <w:tr>
-        <w:tblPrEx>
-          <w:tblCellMar>
-            <w:top w:w="0" w:type="dxa"/>
-            <w:bottom w:w="0" w:type="dxa"/>
-          </w:tblCellMar>
-        </w:tblPrEx>
         <w:tc>
           <w:tcPr>
             <w:tcW w:w="3200" w:type="dxa"/>
@@ -2440,12 +2322,6 @@
         </w:tc>
       </w:tr>
       <w:tr>
-        <w:tblPrEx>
-          <w:tblCellMar>
-            <w:top w:w="0" w:type="dxa"/>
-            <w:bottom w:w="0" w:type="dxa"/>
-          </w:tblCellMar>
-        </w:tblPrEx>
         <w:tc>
           <w:tcPr>
             <w:tcW w:w="3200" w:type="dxa"/>
@@ -2529,12 +2405,6 @@
         </w:tc>
       </w:tr>
       <w:tr>
-        <w:tblPrEx>
-          <w:tblCellMar>
-            <w:top w:w="0" w:type="dxa"/>
-            <w:bottom w:w="0" w:type="dxa"/>
-          </w:tblCellMar>
-        </w:tblPrEx>
         <w:tc>
           <w:tcPr>
             <w:tcW w:w="3200" w:type="dxa"/>
@@ -2618,12 +2488,6 @@
         </w:tc>
       </w:tr>
       <w:tr>
-        <w:tblPrEx>
-          <w:tblCellMar>
-            <w:top w:w="0" w:type="dxa"/>
-            <w:bottom w:w="0" w:type="dxa"/>
-          </w:tblCellMar>
-        </w:tblPrEx>
         <w:tc>
           <w:tcPr>
             <w:tcW w:w="3200" w:type="dxa"/>
@@ -2707,12 +2571,6 @@
         </w:tc>
       </w:tr>
       <w:tr>
-        <w:tblPrEx>
-          <w:tblCellMar>
-            <w:top w:w="0" w:type="dxa"/>
-            <w:bottom w:w="0" w:type="dxa"/>
-          </w:tblCellMar>
-        </w:tblPrEx>
         <w:tc>
           <w:tcPr>
             <w:tcW w:w="3200" w:type="dxa"/>
@@ -3110,12 +2968,6 @@
         <w:gridCol w:w="3860"/>
       </w:tblGrid>
       <w:tr>
-        <w:tblPrEx>
-          <w:tblCellMar>
-            <w:top w:w="0" w:type="dxa"/>
-            <w:bottom w:w="0" w:type="dxa"/>
-          </w:tblCellMar>
-        </w:tblPrEx>
         <w:tc>
           <w:tcPr>
             <w:tcW w:w="5500" w:type="dxa"/>
@@ -3184,12 +3036,6 @@
         </w:tc>
       </w:tr>
       <w:tr>
-        <w:tblPrEx>
-          <w:tblCellMar>
-            <w:top w:w="0" w:type="dxa"/>
-            <w:bottom w:w="0" w:type="dxa"/>
-          </w:tblCellMar>
-        </w:tblPrEx>
         <w:tc>
           <w:tcPr>
             <w:tcW w:w="5500" w:type="dxa"/>
@@ -3246,12 +3092,6 @@
         </w:tc>
       </w:tr>
       <w:tr>
-        <w:tblPrEx>
-          <w:tblCellMar>
-            <w:top w:w="0" w:type="dxa"/>
-            <w:bottom w:w="0" w:type="dxa"/>
-          </w:tblCellMar>
-        </w:tblPrEx>
         <w:tc>
           <w:tcPr>
             <w:tcW w:w="5500" w:type="dxa"/>
@@ -3308,12 +3148,6 @@
         </w:tc>
       </w:tr>
       <w:tr>
-        <w:tblPrEx>
-          <w:tblCellMar>
-            <w:top w:w="0" w:type="dxa"/>
-            <w:bottom w:w="0" w:type="dxa"/>
-          </w:tblCellMar>
-        </w:tblPrEx>
         <w:tc>
           <w:tcPr>
             <w:tcW w:w="5500" w:type="dxa"/>
@@ -3370,12 +3204,6 @@
         </w:tc>
       </w:tr>
       <w:tr>
-        <w:tblPrEx>
-          <w:tblCellMar>
-            <w:top w:w="0" w:type="dxa"/>
-            <w:bottom w:w="0" w:type="dxa"/>
-          </w:tblCellMar>
-        </w:tblPrEx>
         <w:tc>
           <w:tcPr>
             <w:tcW w:w="5500" w:type="dxa"/>
@@ -3432,12 +3260,6 @@
         </w:tc>
       </w:tr>
       <w:tr>
-        <w:tblPrEx>
-          <w:tblCellMar>
-            <w:top w:w="0" w:type="dxa"/>
-            <w:bottom w:w="0" w:type="dxa"/>
-          </w:tblCellMar>
-        </w:tblPrEx>
         <w:tc>
           <w:tcPr>
             <w:tcW w:w="5500" w:type="dxa"/>
@@ -3494,12 +3316,6 @@
         </w:tc>
       </w:tr>
       <w:tr>
-        <w:tblPrEx>
-          <w:tblCellMar>
-            <w:top w:w="0" w:type="dxa"/>
-            <w:bottom w:w="0" w:type="dxa"/>
-          </w:tblCellMar>
-        </w:tblPrEx>
         <w:tc>
           <w:tcPr>
             <w:tcW w:w="5500" w:type="dxa"/>
@@ -3556,12 +3372,6 @@
         </w:tc>
       </w:tr>
       <w:tr>
-        <w:tblPrEx>
-          <w:tblCellMar>
-            <w:top w:w="0" w:type="dxa"/>
-            <w:bottom w:w="0" w:type="dxa"/>
-          </w:tblCellMar>
-        </w:tblPrEx>
         <w:tc>
           <w:tcPr>
             <w:tcW w:w="5500" w:type="dxa"/>
@@ -3618,12 +3428,6 @@
         </w:tc>
       </w:tr>
       <w:tr>
-        <w:tblPrEx>
-          <w:tblCellMar>
-            <w:top w:w="0" w:type="dxa"/>
-            <w:bottom w:w="0" w:type="dxa"/>
-          </w:tblCellMar>
-        </w:tblPrEx>
         <w:tc>
           <w:tcPr>
             <w:tcW w:w="5500" w:type="dxa"/>
@@ -3680,12 +3484,6 @@
         </w:tc>
       </w:tr>
       <w:tr>
-        <w:tblPrEx>
-          <w:tblCellMar>
-            <w:top w:w="0" w:type="dxa"/>
-            <w:bottom w:w="0" w:type="dxa"/>
-          </w:tblCellMar>
-        </w:tblPrEx>
         <w:tc>
           <w:tcPr>
             <w:tcW w:w="5500" w:type="dxa"/>
@@ -3742,12 +3540,6 @@
         </w:tc>
       </w:tr>
       <w:tr>
-        <w:tblPrEx>
-          <w:tblCellMar>
-            <w:top w:w="0" w:type="dxa"/>
-            <w:bottom w:w="0" w:type="dxa"/>
-          </w:tblCellMar>
-        </w:tblPrEx>
         <w:tc>
           <w:tcPr>
             <w:tcW w:w="5500" w:type="dxa"/>
@@ -3804,12 +3596,6 @@
         </w:tc>
       </w:tr>
       <w:tr>
-        <w:tblPrEx>
-          <w:tblCellMar>
-            <w:top w:w="0" w:type="dxa"/>
-            <w:bottom w:w="0" w:type="dxa"/>
-          </w:tblCellMar>
-        </w:tblPrEx>
         <w:tc>
           <w:tcPr>
             <w:tcW w:w="5500" w:type="dxa"/>
@@ -3866,12 +3652,6 @@
         </w:tc>
       </w:tr>
       <w:tr>
-        <w:tblPrEx>
-          <w:tblCellMar>
-            <w:top w:w="0" w:type="dxa"/>
-            <w:bottom w:w="0" w:type="dxa"/>
-          </w:tblCellMar>
-        </w:tblPrEx>
         <w:tc>
           <w:tcPr>
             <w:tcW w:w="5500" w:type="dxa"/>
@@ -3928,12 +3708,6 @@
         </w:tc>
       </w:tr>
       <w:tr>
-        <w:tblPrEx>
-          <w:tblCellMar>
-            <w:top w:w="0" w:type="dxa"/>
-            <w:bottom w:w="0" w:type="dxa"/>
-          </w:tblCellMar>
-        </w:tblPrEx>
         <w:tc>
           <w:tcPr>
             <w:tcW w:w="5500" w:type="dxa"/>
@@ -3990,12 +3764,6 @@
         </w:tc>
       </w:tr>
       <w:tr>
-        <w:tblPrEx>
-          <w:tblCellMar>
-            <w:top w:w="0" w:type="dxa"/>
-            <w:bottom w:w="0" w:type="dxa"/>
-          </w:tblCellMar>
-        </w:tblPrEx>
         <w:tc>
           <w:tcPr>
             <w:tcW w:w="5500" w:type="dxa"/>
@@ -4052,12 +3820,6 @@
         </w:tc>
       </w:tr>
       <w:tr>
-        <w:tblPrEx>
-          <w:tblCellMar>
-            <w:top w:w="0" w:type="dxa"/>
-            <w:bottom w:w="0" w:type="dxa"/>
-          </w:tblCellMar>
-        </w:tblPrEx>
         <w:tc>
           <w:tcPr>
             <w:tcW w:w="5500" w:type="dxa"/>
@@ -4114,12 +3876,6 @@
         </w:tc>
       </w:tr>
       <w:tr>
-        <w:tblPrEx>
-          <w:tblCellMar>
-            <w:top w:w="0" w:type="dxa"/>
-            <w:bottom w:w="0" w:type="dxa"/>
-          </w:tblCellMar>
-        </w:tblPrEx>
         <w:tc>
           <w:tcPr>
             <w:tcW w:w="5500" w:type="dxa"/>
@@ -4176,12 +3932,6 @@
         </w:tc>
       </w:tr>
       <w:tr>
-        <w:tblPrEx>
-          <w:tblCellMar>
-            <w:top w:w="0" w:type="dxa"/>
-            <w:bottom w:w="0" w:type="dxa"/>
-          </w:tblCellMar>
-        </w:tblPrEx>
         <w:tc>
           <w:tcPr>
             <w:tcW w:w="5500" w:type="dxa"/>
@@ -4238,12 +3988,6 @@
         </w:tc>
       </w:tr>
       <w:tr>
-        <w:tblPrEx>
-          <w:tblCellMar>
-            <w:top w:w="0" w:type="dxa"/>
-            <w:bottom w:w="0" w:type="dxa"/>
-          </w:tblCellMar>
-        </w:tblPrEx>
         <w:tc>
           <w:tcPr>
             <w:tcW w:w="5500" w:type="dxa"/>
@@ -4300,12 +4044,6 @@
         </w:tc>
       </w:tr>
       <w:tr>
-        <w:tblPrEx>
-          <w:tblCellMar>
-            <w:top w:w="0" w:type="dxa"/>
-            <w:bottom w:w="0" w:type="dxa"/>
-          </w:tblCellMar>
-        </w:tblPrEx>
         <w:tc>
           <w:tcPr>
             <w:tcW w:w="5500" w:type="dxa"/>
@@ -4362,12 +4100,6 @@
         </w:tc>
       </w:tr>
       <w:tr>
-        <w:tblPrEx>
-          <w:tblCellMar>
-            <w:top w:w="0" w:type="dxa"/>
-            <w:bottom w:w="0" w:type="dxa"/>
-          </w:tblCellMar>
-        </w:tblPrEx>
         <w:tc>
           <w:tcPr>
             <w:tcW w:w="5500" w:type="dxa"/>
@@ -4439,9 +4171,6 @@
       <w:r>
         <w:lastRenderedPageBreak/>
         <w:t>7. Recommendations</w:t>
-      </w:r>
-      <w:r>
-        <w:t xml:space="preserve"> and Findings</w:t>
       </w:r>
     </w:p>
     <w:p>

</xml_diff>